<commit_message>
Align AI-103 courseware with pinned Microsoft Learn labs
</commit_message>
<xml_diff>
--- a/courseware/LP-Developing AI Apps and Agents on Azure (AI-103).docx
+++ b/courseware/LP-Developing AI Apps and Agents on Azure (AI-103).docx
@@ -188,7 +188,7 @@
           <w:color w:val="1F6FEB"/>
           <w:sz w:val="24"/>
         </w:rPr>
-        <w:t>Version 4.0</w:t>
+        <w:t>Version 5.0</w:t>
       </w:r>
     </w:p>
     <w:p>
@@ -467,7 +467,73 @@
                 <w:color w:val="161B26"/>
                 <w:sz w:val="18"/>
               </w:rPr>
-              <w:t>Updated to v4.0 deck slide map, AI-103 scope, 10 mechanism-led labs, and approved 60+60 minute assessments.</w:t>
+              <w:t>Five-domain AI-103 courseware and original Tertiary labs</w:t>
+            </w:r>
+          </w:p>
+        </w:tc>
+        <w:tc>
+          <w:tcPr>
+            <w:tcW w:type="dxa" w:w="2459"/>
+          </w:tcPr>
+          <w:p>
+            <w:r>
+              <w:rPr>
+                <w:rFonts w:ascii="Arial" w:hAnsi="Arial"/>
+                <w:b w:val="0"/>
+                <w:color w:val="161B26"/>
+                <w:sz w:val="18"/>
+              </w:rPr>
+              <w:t>Tertiary Infotech Academy Pte Ltd</w:t>
+            </w:r>
+          </w:p>
+        </w:tc>
+      </w:tr>
+      <w:tr>
+        <w:tc>
+          <w:tcPr>
+            <w:tcW w:type="dxa" w:w="2459"/>
+          </w:tcPr>
+          <w:p>
+            <w:r>
+              <w:rPr>
+                <w:rFonts w:ascii="Arial" w:hAnsi="Arial"/>
+                <w:b w:val="0"/>
+                <w:color w:val="161B26"/>
+                <w:sz w:val="18"/>
+              </w:rPr>
+              <w:t>5.0</w:t>
+            </w:r>
+          </w:p>
+        </w:tc>
+        <w:tc>
+          <w:tcPr>
+            <w:tcW w:type="dxa" w:w="2459"/>
+          </w:tcPr>
+          <w:p>
+            <w:r>
+              <w:rPr>
+                <w:rFonts w:ascii="Arial" w:hAnsi="Arial"/>
+                <w:b w:val="0"/>
+                <w:color w:val="161B26"/>
+                <w:sz w:val="18"/>
+              </w:rPr>
+              <w:t>27 Sep 2026</w:t>
+            </w:r>
+          </w:p>
+        </w:tc>
+        <w:tc>
+          <w:tcPr>
+            <w:tcW w:type="dxa" w:w="2459"/>
+          </w:tcPr>
+          <w:p>
+            <w:r>
+              <w:rPr>
+                <w:rFonts w:ascii="Arial" w:hAnsi="Arial"/>
+                <w:b w:val="0"/>
+                <w:color w:val="161B26"/>
+                <w:sz w:val="18"/>
+              </w:rPr>
+              <w:t>Updated to v5.0 deck slide map, pinned MicrosoftLearning lab sources, five AI-103 domains, and approved 60+60 minute assessments.</w:t>
             </w:r>
           </w:p>
         </w:tc>
@@ -894,7 +960,7 @@
                 <w:color w:val="161B26"/>
                 <w:sz w:val="16"/>
               </w:rPr>
-              <w:t>Topic/Lab 01: Plan, Manage, Monitor, and Secure an Azure AI Solution</w:t>
+              <w:t>Topic/Lab 01: Plan a Foundry project</w:t>
             </w:r>
           </w:p>
         </w:tc>
@@ -928,7 +994,7 @@
                 <w:color w:val="161B26"/>
                 <w:sz w:val="16"/>
               </w:rPr>
-              <w:t>Slides 17–26</w:t>
+              <w:t>Slides 17–34</w:t>
             </w:r>
           </w:p>
         </w:tc>
@@ -984,7 +1050,7 @@
                 <w:color w:val="161B26"/>
                 <w:sz w:val="16"/>
               </w:rPr>
-              <w:t>Topic/Lab 02: Responsible AI, Content Safety, Governance</w:t>
+              <w:t>Topic/Lab 02: Evaluate models and release guardrails</w:t>
             </w:r>
           </w:p>
         </w:tc>
@@ -1020,7 +1086,7 @@
                 <w:color w:val="161B26"/>
                 <w:sz w:val="16"/>
               </w:rPr>
-              <w:t>Slides 27–37</w:t>
+              <w:t>Slides 35–53</w:t>
             </w:r>
           </w:p>
         </w:tc>
@@ -1073,7 +1139,7 @@
                 <w:color w:val="161B26"/>
                 <w:sz w:val="16"/>
               </w:rPr>
-              <w:t>Topic/Lab 03: Generative AI, Foundry, Azure OpenAI, Foundry Workflow, RAG</w:t>
+              <w:t>Topic/Lab 03: Build a generative chat app</w:t>
             </w:r>
           </w:p>
         </w:tc>
@@ -1107,7 +1173,7 @@
                 <w:color w:val="161B26"/>
                 <w:sz w:val="16"/>
               </w:rPr>
-              <w:t>Slides 38–47</w:t>
+              <w:t>Slides 54–71</w:t>
             </w:r>
           </w:p>
         </w:tc>
@@ -1163,7 +1229,7 @@
                 <w:color w:val="161B26"/>
                 <w:sz w:val="16"/>
               </w:rPr>
-              <w:t>Topic/Lab 04: Agentic AI, Foundry Agent Service, Multi-Agent Concepts</w:t>
+              <w:t>Topic/Lab 04: Build a Foundry agent</w:t>
             </w:r>
           </w:p>
         </w:tc>
@@ -1199,7 +1265,7 @@
                 <w:color w:val="161B26"/>
                 <w:sz w:val="16"/>
               </w:rPr>
-              <w:t>Slides 48–57</w:t>
+              <w:t>Slides 72–89</w:t>
             </w:r>
           </w:p>
         </w:tc>
@@ -1252,7 +1318,7 @@
                 <w:color w:val="161B26"/>
                 <w:sz w:val="16"/>
               </w:rPr>
-              <w:t>Topic/Lab 05: Image and Video Generation, Multimodal Understanding</w:t>
+              <w:t>Topic/Lab 05: Use a custom tool in an agent</w:t>
             </w:r>
           </w:p>
         </w:tc>
@@ -1286,7 +1352,7 @@
                 <w:color w:val="161B26"/>
                 <w:sz w:val="16"/>
               </w:rPr>
-              <w:t>Slides 58–67</w:t>
+              <w:t>Slides 90–107</w:t>
             </w:r>
           </w:p>
         </w:tc>
@@ -1342,7 +1408,7 @@
                 <w:color w:val="161B26"/>
                 <w:sz w:val="16"/>
               </w:rPr>
-              <w:t>Topic/Lab 06: NLP, Language, Speech, Translation</w:t>
+              <w:t>Topic/Lab 06: Develop a vision-enabled chat app</w:t>
             </w:r>
           </w:p>
         </w:tc>
@@ -1378,7 +1444,7 @@
                 <w:color w:val="161B26"/>
                 <w:sz w:val="16"/>
               </w:rPr>
-              <w:t>Slides 68–77</w:t>
+              <w:t>Slides 108–125</w:t>
             </w:r>
           </w:p>
         </w:tc>
@@ -1736,7 +1802,7 @@
                 <w:color w:val="161B26"/>
                 <w:sz w:val="16"/>
               </w:rPr>
-              <w:t>Slides 17–77</w:t>
+              <w:t>Slides 17–125</w:t>
             </w:r>
           </w:p>
         </w:tc>
@@ -1823,7 +1889,7 @@
                 <w:color w:val="161B26"/>
                 <w:sz w:val="16"/>
               </w:rPr>
-              <w:t>Slide 78</w:t>
+              <w:t>Slide 126</w:t>
             </w:r>
           </w:p>
         </w:tc>
@@ -1879,7 +1945,7 @@
                 <w:color w:val="161B26"/>
                 <w:sz w:val="16"/>
               </w:rPr>
-              <w:t>Topic/Lab 07: Generative Text Analysis and Translation</w:t>
+              <w:t>Topic/Lab 07: Analyze text</w:t>
             </w:r>
           </w:p>
         </w:tc>
@@ -1915,7 +1981,7 @@
                 <w:color w:val="161B26"/>
                 <w:sz w:val="16"/>
               </w:rPr>
-              <w:t>Slides 79–88</w:t>
+              <w:t>Slides 127–144</w:t>
             </w:r>
           </w:p>
         </w:tc>
@@ -1968,7 +2034,7 @@
                 <w:color w:val="161B26"/>
                 <w:sz w:val="16"/>
               </w:rPr>
-              <w:t>Topic/Lab 08: Azure AI Search, Knowledge Mining, Vector Search</w:t>
+              <w:t>Topic/Lab 08: Develop a text analysis agent</w:t>
             </w:r>
           </w:p>
         </w:tc>
@@ -2002,7 +2068,7 @@
                 <w:color w:val="161B26"/>
                 <w:sz w:val="16"/>
               </w:rPr>
-              <w:t>Slides 89–98</w:t>
+              <w:t>Slides 145–162</w:t>
             </w:r>
           </w:p>
         </w:tc>
@@ -2058,7 +2124,7 @@
                 <w:color w:val="161B26"/>
                 <w:sz w:val="16"/>
               </w:rPr>
-              <w:t>Topic/Lab 09: Document Intelligence and Content Understanding</w:t>
+              <w:t>Topic/Lab 09: Extract multimodal information</w:t>
             </w:r>
           </w:p>
         </w:tc>
@@ -2094,7 +2160,7 @@
                 <w:color w:val="161B26"/>
                 <w:sz w:val="16"/>
               </w:rPr>
-              <w:t>Slides 99–109</w:t>
+              <w:t>Slides 163–181</w:t>
             </w:r>
           </w:p>
         </w:tc>
@@ -2147,7 +2213,7 @@
                 <w:color w:val="161B26"/>
                 <w:sz w:val="16"/>
               </w:rPr>
-              <w:t>Topic/Lab 10: AI-103 Capstone and Course Review</w:t>
+              <w:t>Topic/Lab 10: Build a knowledge mining solution</w:t>
             </w:r>
           </w:p>
         </w:tc>
@@ -2181,7 +2247,7 @@
                 <w:color w:val="161B26"/>
                 <w:sz w:val="16"/>
               </w:rPr>
-              <w:t>Slides 110–120</w:t>
+              <w:t>Slides 182–199</w:t>
             </w:r>
           </w:p>
         </w:tc>
@@ -2539,7 +2605,7 @@
                 <w:color w:val="161B26"/>
                 <w:sz w:val="16"/>
               </w:rPr>
-              <w:t>Slides 123–125</w:t>
+              <w:t>Slides 202–204</w:t>
             </w:r>
           </w:p>
         </w:tc>
@@ -2558,7 +2624,7 @@
         <w:pStyle w:val="Heading2"/>
       </w:pPr>
       <w:r>
-        <w:t>Topic 01 - Plan, secure, and operate Foundry services · Slides 17–26</w:t>
+        <w:t>Topic 01 - Plan a Foundry project · Slides 17–34</w:t>
       </w:r>
     </w:p>
     <w:p>
@@ -2566,7 +2632,7 @@
         <w:pStyle w:val="Heading3"/>
       </w:pPr>
       <w:r>
-        <w:t>Lab 01 - Plan, Manage, Monitor, and Secure an Azure AI Solution · Slide 25</w:t>
+        <w:t>Lab 01 - Plan a Foundry project · Slide 25</w:t>
       </w:r>
     </w:p>
     <w:p>
@@ -2579,7 +2645,7 @@
         <w:pStyle w:val="Heading2"/>
       </w:pPr>
       <w:r>
-        <w:t>Topic 02 - Responsible AI, content safety, and governance · Slides 27–37</w:t>
+        <w:t>Topic 02 - Evaluate models and release guardrails · Slides 35–53</w:t>
       </w:r>
     </w:p>
     <w:p>
@@ -2587,7 +2653,7 @@
         <w:pStyle w:val="Heading3"/>
       </w:pPr>
       <w:r>
-        <w:t>Lab 02 - Responsible AI, Content Safety, Governance · Slide 36</w:t>
+        <w:t>Lab 02 - Evaluate models and release guardrails · Slide 44</w:t>
       </w:r>
     </w:p>
     <w:p>
@@ -2600,7 +2666,7 @@
         <w:pStyle w:val="Heading2"/>
       </w:pPr>
       <w:r>
-        <w:t>Topic 03 - Generative AI apps and grounded RAG · Slides 38–47</w:t>
+        <w:t>Topic 03 - Build a generative chat app · Slides 54–71</w:t>
       </w:r>
     </w:p>
     <w:p>
@@ -2608,7 +2674,7 @@
         <w:pStyle w:val="Heading3"/>
       </w:pPr>
       <w:r>
-        <w:t>Lab 03 - Generative AI, Foundry, Azure OpenAI, Foundry Workflow, RAG · Slide 46</w:t>
+        <w:t>Lab 03 - Build a generative chat app · Slide 62</w:t>
       </w:r>
     </w:p>
     <w:p>
@@ -2621,7 +2687,7 @@
         <w:pStyle w:val="Heading2"/>
       </w:pPr>
       <w:r>
-        <w:t>Topic 04 - Agents, tools, memory, and multi-agent control · Slides 48–57</w:t>
+        <w:t>Topic 04 - Build a Foundry agent · Slides 72–89</w:t>
       </w:r>
     </w:p>
     <w:p>
@@ -2629,7 +2695,7 @@
         <w:pStyle w:val="Heading3"/>
       </w:pPr>
       <w:r>
-        <w:t>Lab 04 - Agentic AI, Foundry Agent Service, Multi-Agent Concepts · Slide 56</w:t>
+        <w:t>Lab 04 - Build a Foundry agent · Slide 80</w:t>
       </w:r>
     </w:p>
     <w:p>
@@ -2642,7 +2708,7 @@
         <w:pStyle w:val="Heading2"/>
       </w:pPr>
       <w:r>
-        <w:t>Topic 05 - Image/video generation and multimodal understanding · Slides 58–67</w:t>
+        <w:t>Topic 05 - Use a custom tool in an agent · Slides 90–107</w:t>
       </w:r>
     </w:p>
     <w:p>
@@ -2650,7 +2716,7 @@
         <w:pStyle w:val="Heading3"/>
       </w:pPr>
       <w:r>
-        <w:t>Lab 05 - Image and Video Generation, Multimodal Understanding · Slide 66</w:t>
+        <w:t>Lab 05 - Use a custom tool in an agent · Slide 98</w:t>
       </w:r>
     </w:p>
     <w:p>
@@ -2663,7 +2729,7 @@
         <w:pStyle w:val="Heading2"/>
       </w:pPr>
       <w:r>
-        <w:t>Topic 06 - Language, speech, translation, and SSML · Slides 68–77</w:t>
+        <w:t>Topic 06 - Develop a vision-enabled chat app · Slides 108–125</w:t>
       </w:r>
     </w:p>
     <w:p>
@@ -2671,7 +2737,7 @@
         <w:pStyle w:val="Heading3"/>
       </w:pPr>
       <w:r>
-        <w:t>Lab 06 - NLP, Language, Speech, Translation · Slide 76</w:t>
+        <w:t>Lab 06 - Develop a vision-enabled chat app · Slide 116</w:t>
       </w:r>
     </w:p>
     <w:p>
@@ -2684,7 +2750,7 @@
         <w:pStyle w:val="Heading2"/>
       </w:pPr>
       <w:r>
-        <w:t>Topic 07 - Generative text analysis and translation · Slides 79–88</w:t>
+        <w:t>Topic 07 - Analyze text · Slides 127–144</w:t>
       </w:r>
     </w:p>
     <w:p>
@@ -2692,7 +2758,7 @@
         <w:pStyle w:val="Heading3"/>
       </w:pPr>
       <w:r>
-        <w:t>Lab 07 - Generative Text Analysis and Translation · Slide 87</w:t>
+        <w:t>Lab 07 - Analyze text · Slide 135</w:t>
       </w:r>
     </w:p>
     <w:p>
@@ -2705,7 +2771,7 @@
         <w:pStyle w:val="Heading2"/>
       </w:pPr>
       <w:r>
-        <w:t>Topic 08 - Knowledge retrieval, indexing, and grounding · Slides 89–98</w:t>
+        <w:t>Topic 08 - Develop a text analysis agent · Slides 145–162</w:t>
       </w:r>
     </w:p>
     <w:p>
@@ -2713,7 +2779,7 @@
         <w:pStyle w:val="Heading3"/>
       </w:pPr>
       <w:r>
-        <w:t>Lab 08 - Azure AI Search, Knowledge Mining, Vector Search · Slide 97</w:t>
+        <w:t>Lab 08 - Develop a text analysis agent · Slide 153</w:t>
       </w:r>
     </w:p>
     <w:p>
@@ -2726,7 +2792,7 @@
         <w:pStyle w:val="Heading2"/>
       </w:pPr>
       <w:r>
-        <w:t>Topic 09 - Document Intelligence and Content Understanding · Slides 99–109</w:t>
+        <w:t>Topic 09 - Extract multimodal information · Slides 163–181</w:t>
       </w:r>
     </w:p>
     <w:p>
@@ -2734,7 +2800,7 @@
         <w:pStyle w:val="Heading3"/>
       </w:pPr>
       <w:r>
-        <w:t>Lab 09 - Document Intelligence and Content Understanding · Slide 108</w:t>
+        <w:t>Lab 09 - Extract multimodal information · Slide 172</w:t>
       </w:r>
     </w:p>
     <w:p>
@@ -2747,7 +2813,7 @@
         <w:pStyle w:val="Heading2"/>
       </w:pPr>
       <w:r>
-        <w:t>Topic 10 - Capstone: production AI solution decision record · Slides 110–120</w:t>
+        <w:t>Topic 10 - Build a knowledge mining solution · Slides 182–199</w:t>
       </w:r>
     </w:p>
     <w:p>
@@ -2755,7 +2821,7 @@
         <w:pStyle w:val="Heading3"/>
       </w:pPr>
       <w:r>
-        <w:t>Lab 10 - AI-103 Capstone and Course Review · Slide 119</w:t>
+        <w:t>Lab 10 - Build a knowledge mining solution · Slide 190</w:t>
       </w:r>
     </w:p>
     <w:p>

</xml_diff>